<commit_message>
Add qualitative theme diagram, participant matrix and joint display
</commit_message>
<xml_diff>
--- a/tez-calisma-ciktilari-2026-10-20/nitel-analiz-2026-10-22/NITEL-BULGULAR-VE-ICERIK-ANALIZI.docx
+++ b/tez-calisma-ciktilari-2026-10-20/nitel-analiz-2026-10-22/NITEL-BULGULAR-VE-ICERIK-ANALIZI.docx
@@ -161,6 +161,89 @@
           <w:i w:val="0"/>
         </w:rPr>
         <w:t>Görüşme formundaki 1, 3 ve 5-a başlıkları problem çözme deneyimleri ve algılanan beceri katkılarını; 2 ve 5-b başlıkları iletişim ve grup etkileşimini; 4, 6 ve 7 başlıkları ise öğrenme, süreç değerlendirmesi ve önerileri ele almaktadır. Bu başlıklar kesin sınırlar olarak kullanılmamış, aynı konunun başka bir yanıtta yer alması da dikkate alınmıştır.</w:t>
+      </w:r>
+    </w:p>
+    <w:p>
+      <w:pPr>
+        <w:keepNext/>
+        <w:spacing w:after="100" w:line="312" w:lineRule="auto"/>
+        <w:jc w:val="both"/>
+      </w:pPr>
+      <w:r>
+        <w:rPr>
+          <w:rFonts w:ascii="Times New Roman" w:hAnsi="Times New Roman"/>
+          <w:sz w:val="24"/>
+        </w:rPr>
+        <w:t>İçerik analizinin tema, kategori ve örnek kod yapısı Şekil 4.4’te gösterilmiştir. Şema, ayrıntılı kod kitabının görsel özetidir.</w:t>
+      </w:r>
+    </w:p>
+    <w:p>
+      <w:pPr>
+        <w:keepNext/>
+        <w:spacing w:line="240" w:lineRule="auto"/>
+        <w:jc w:val="center"/>
+      </w:pPr>
+      <w:r>
+        <w:drawing>
+          <wp:inline xmlns:a="http://schemas.openxmlformats.org/drawingml/2006/main" xmlns:pic="http://schemas.openxmlformats.org/drawingml/2006/picture">
+            <wp:extent cx="5760000" cy="5842286"/>
+            <wp:docPr id="1" name="Picture 1"/>
+            <wp:cNvGraphicFramePr>
+              <a:graphicFrameLocks noChangeAspect="1"/>
+            </wp:cNvGraphicFramePr>
+            <a:graphic>
+              <a:graphicData uri="http://schemas.openxmlformats.org/drawingml/2006/picture">
+                <pic:pic>
+                  <pic:nvPicPr>
+                    <pic:cNvPr id="0" name="sekil-4-4-nitel-tema-semasi.png"/>
+                    <pic:cNvPicPr/>
+                  </pic:nvPicPr>
+                  <pic:blipFill>
+                    <a:blip r:embed="rId10"/>
+                    <a:stretch>
+                      <a:fillRect/>
+                    </a:stretch>
+                  </pic:blipFill>
+                  <pic:spPr>
+                    <a:xfrm>
+                      <a:off x="0" y="0"/>
+                      <a:ext cx="5760000" cy="5842286"/>
+                    </a:xfrm>
+                    <a:prstGeom prst="rect"/>
+                  </pic:spPr>
+                </pic:pic>
+              </a:graphicData>
+            </a:graphic>
+          </wp:inline>
+        </w:drawing>
+      </w:r>
+    </w:p>
+    <w:p>
+      <w:pPr>
+        <w:keepNext/>
+        <w:spacing w:after="100" w:line="312" w:lineRule="auto"/>
+        <w:jc w:val="both"/>
+      </w:pPr>
+      <w:r>
+        <w:rPr>
+          <w:rFonts w:ascii="Times New Roman" w:hAnsi="Times New Roman"/>
+          <w:b/>
+          <w:sz w:val="22"/>
+        </w:rPr>
+        <w:t>Şekil 4.4. Nitel içerik analizinin tema–kategori–örnek kod yapısı</w:t>
+      </w:r>
+    </w:p>
+    <w:p>
+      <w:pPr>
+        <w:spacing w:after="100" w:line="288" w:lineRule="auto"/>
+        <w:jc w:val="both"/>
+      </w:pPr>
+      <w:r>
+        <w:rPr>
+          <w:rFonts w:ascii="Times New Roman" w:hAnsi="Times New Roman"/>
+          <w:sz w:val="20"/>
+        </w:rPr>
+        <w:t>Not. Dört tema ve her temadaki kategoriler gösterilmiştir; madde işaretli satırlar seçilmiş kod örnekleridir. Şema 53 kodun tamamını listelemez. Kodların tam tanımları kod kitabında, frekansları ilgili bulgu tablolarındadır. Çizgiler sınıflama yapısını göstermekte, nedensel ilişki veya önem sırası ifade etmemektedir.</w:t>
       </w:r>
     </w:p>
     <w:p>
@@ -4654,6 +4737,783 @@
     </w:p>
     <w:p>
       <w:pPr>
+        <w:spacing w:after="100" w:line="312" w:lineRule="auto"/>
+        <w:jc w:val="both"/>
+      </w:pPr>
+      <w:r>
+        <w:rPr>
+          <w:rFonts w:ascii="Times New Roman" w:hAnsi="Times New Roman"/>
+          <w:sz w:val="24"/>
+        </w:rPr>
+        <w:t>Katılımcıların ortak ve ayrışan deneyimleri Tablo 4.19’da birlikte sunulmuştur. Bu matris, önceki tabloların frekanslarından farklı olarak her katılımcının deneyimini kendi bağlamında karşılaştırmaktadır.</w:t>
+      </w:r>
+    </w:p>
+    <w:p>
+      <w:pPr>
+        <w:keepNext/>
+        <w:spacing w:after="100" w:line="312" w:lineRule="auto"/>
+        <w:jc w:val="both"/>
+      </w:pPr>
+      <w:r>
+        <w:rPr>
+          <w:rFonts w:ascii="Times New Roman" w:hAnsi="Times New Roman"/>
+          <w:b/>
+          <w:sz w:val="22"/>
+        </w:rPr>
+        <w:t>Tablo 4.19. Katılımcıların ortak ve ayrışan deneyimlerinin karşılaştırılması</w:t>
+      </w:r>
+    </w:p>
+    <w:tbl>
+      <w:tblPr>
+        <w:tblStyle w:val="TableGrid"/>
+        <w:tblW w:type="auto" w:w="0"/>
+        <w:tblLayout w:type="fixed"/>
+        <w:tblLook w:firstColumn="1" w:firstRow="1" w:lastColumn="0" w:lastRow="0" w:noHBand="0" w:noVBand="1" w:val="04A0"/>
+      </w:tblPr>
+      <w:tblGrid>
+        <w:gridCol w:w="1417"/>
+        <w:gridCol w:w="1956"/>
+        <w:gridCol w:w="1956"/>
+        <w:gridCol w:w="1956"/>
+        <w:gridCol w:w="1956"/>
+      </w:tblGrid>
+      <w:tr>
+        <w:trPr>
+          <w:tblHeader/>
+          <w:cantSplit/>
+        </w:trPr>
+        <w:tc>
+          <w:tcPr>
+            <w:tcW w:type="dxa" w:w="1860"/>
+          </w:tcPr>
+          <w:p>
+            <w:pPr>
+              <w:spacing w:before="40" w:after="60" w:line="252" w:lineRule="auto"/>
+            </w:pPr>
+            <w:r>
+              <w:rPr>
+                <w:rFonts w:ascii="Times New Roman" w:hAnsi="Times New Roman"/>
+                <w:sz w:val="18"/>
+              </w:rPr>
+              <w:t>Boyut</w:t>
+            </w:r>
+          </w:p>
+        </w:tc>
+        <w:tc>
+          <w:tcPr>
+            <w:tcW w:type="dxa" w:w="1860"/>
+          </w:tcPr>
+          <w:p>
+            <w:pPr>
+              <w:spacing w:before="40" w:after="60" w:line="252" w:lineRule="auto"/>
+            </w:pPr>
+            <w:r>
+              <w:rPr>
+                <w:rFonts w:ascii="Times New Roman" w:hAnsi="Times New Roman"/>
+                <w:sz w:val="18"/>
+              </w:rPr>
+              <w:t>K1</w:t>
+            </w:r>
+          </w:p>
+        </w:tc>
+        <w:tc>
+          <w:tcPr>
+            <w:tcW w:type="dxa" w:w="1860"/>
+          </w:tcPr>
+          <w:p>
+            <w:pPr>
+              <w:spacing w:before="40" w:after="60" w:line="252" w:lineRule="auto"/>
+            </w:pPr>
+            <w:r>
+              <w:rPr>
+                <w:rFonts w:ascii="Times New Roman" w:hAnsi="Times New Roman"/>
+                <w:sz w:val="18"/>
+              </w:rPr>
+              <w:t>K2</w:t>
+            </w:r>
+          </w:p>
+        </w:tc>
+        <w:tc>
+          <w:tcPr>
+            <w:tcW w:type="dxa" w:w="1860"/>
+          </w:tcPr>
+          <w:p>
+            <w:pPr>
+              <w:spacing w:before="40" w:after="60" w:line="252" w:lineRule="auto"/>
+            </w:pPr>
+            <w:r>
+              <w:rPr>
+                <w:rFonts w:ascii="Times New Roman" w:hAnsi="Times New Roman"/>
+                <w:sz w:val="18"/>
+              </w:rPr>
+              <w:t>K3</w:t>
+            </w:r>
+          </w:p>
+        </w:tc>
+        <w:tc>
+          <w:tcPr>
+            <w:tcW w:type="dxa" w:w="1860"/>
+          </w:tcPr>
+          <w:p>
+            <w:pPr>
+              <w:spacing w:before="40" w:after="60" w:line="252" w:lineRule="auto"/>
+            </w:pPr>
+            <w:r>
+              <w:rPr>
+                <w:rFonts w:ascii="Times New Roman" w:hAnsi="Times New Roman"/>
+                <w:sz w:val="18"/>
+              </w:rPr>
+              <w:t>K4</w:t>
+            </w:r>
+          </w:p>
+        </w:tc>
+      </w:tr>
+      <w:tr>
+        <w:trPr>
+          <w:cantSplit/>
+        </w:trPr>
+        <w:tc>
+          <w:tcPr>
+            <w:tcW w:type="dxa" w:w="1417"/>
+          </w:tcPr>
+          <w:p>
+            <w:pPr>
+              <w:spacing w:before="40" w:after="60" w:line="252" w:lineRule="auto"/>
+            </w:pPr>
+            <w:r>
+              <w:rPr>
+                <w:rFonts w:ascii="Times New Roman" w:hAnsi="Times New Roman"/>
+                <w:sz w:val="18"/>
+              </w:rPr>
+              <w:t>Problem belirleme</w:t>
+            </w:r>
+          </w:p>
+        </w:tc>
+        <w:tc>
+          <w:tcPr>
+            <w:tcW w:type="dxa" w:w="1956"/>
+          </w:tcPr>
+          <w:p>
+            <w:pPr>
+              <w:spacing w:before="40" w:after="60" w:line="252" w:lineRule="auto"/>
+            </w:pPr>
+            <w:r>
+              <w:rPr>
+                <w:rFonts w:ascii="Times New Roman" w:hAnsi="Times New Roman"/>
+                <w:sz w:val="18"/>
+              </w:rPr>
+              <w:t>Zorlandı; özgünlük ve çözülebilirlik (1-a).</w:t>
+            </w:r>
+          </w:p>
+        </w:tc>
+        <w:tc>
+          <w:tcPr>
+            <w:tcW w:type="dxa" w:w="1956"/>
+          </w:tcPr>
+          <w:p>
+            <w:pPr>
+              <w:spacing w:before="40" w:after="60" w:line="252" w:lineRule="auto"/>
+            </w:pPr>
+            <w:r>
+              <w:rPr>
+                <w:rFonts w:ascii="Times New Roman" w:hAnsi="Times New Roman"/>
+                <w:sz w:val="18"/>
+              </w:rPr>
+              <w:t>Zorlanmadı; kısa araştırma yeterli oldu (1-a).</w:t>
+            </w:r>
+          </w:p>
+        </w:tc>
+        <w:tc>
+          <w:tcPr>
+            <w:tcW w:type="dxa" w:w="1956"/>
+          </w:tcPr>
+          <w:p>
+            <w:pPr>
+              <w:spacing w:before="40" w:after="60" w:line="252" w:lineRule="auto"/>
+            </w:pPr>
+            <w:r>
+              <w:rPr>
+                <w:rFonts w:ascii="Times New Roman" w:hAnsi="Times New Roman"/>
+                <w:sz w:val="18"/>
+              </w:rPr>
+              <w:t>Zorlandı; özgün problem/proje arayışı (1-a).</w:t>
+            </w:r>
+          </w:p>
+        </w:tc>
+        <w:tc>
+          <w:tcPr>
+            <w:tcW w:type="dxa" w:w="1956"/>
+          </w:tcPr>
+          <w:p>
+            <w:pPr>
+              <w:spacing w:before="40" w:after="60" w:line="252" w:lineRule="auto"/>
+            </w:pPr>
+            <w:r>
+              <w:rPr>
+                <w:rFonts w:ascii="Times New Roman" w:hAnsi="Times New Roman"/>
+                <w:sz w:val="18"/>
+              </w:rPr>
+              <w:t>Zorlandı; yapılabilir proje seçimi (1-a).</w:t>
+            </w:r>
+          </w:p>
+        </w:tc>
+      </w:tr>
+      <w:tr>
+        <w:trPr>
+          <w:cantSplit/>
+        </w:trPr>
+        <w:tc>
+          <w:tcPr>
+            <w:tcW w:type="dxa" w:w="1417"/>
+          </w:tcPr>
+          <w:p>
+            <w:pPr>
+              <w:spacing w:before="40" w:after="60" w:line="252" w:lineRule="auto"/>
+            </w:pPr>
+            <w:r>
+              <w:rPr>
+                <w:rFonts w:ascii="Times New Roman" w:hAnsi="Times New Roman"/>
+                <w:sz w:val="18"/>
+              </w:rPr>
+              <w:t>Çözüm güçlüğüne yaklaşım</w:t>
+            </w:r>
+          </w:p>
+        </w:tc>
+        <w:tc>
+          <w:tcPr>
+            <w:tcW w:type="dxa" w:w="1956"/>
+          </w:tcPr>
+          <w:p>
+            <w:pPr>
+              <w:spacing w:before="40" w:after="60" w:line="252" w:lineRule="auto"/>
+            </w:pPr>
+            <w:r>
+              <w:rPr>
+                <w:rFonts w:ascii="Times New Roman" w:hAnsi="Times New Roman"/>
+                <w:sz w:val="18"/>
+              </w:rPr>
+              <w:t>Çözüm üretemeyince problemi değiştirdi (3-b).</w:t>
+            </w:r>
+          </w:p>
+        </w:tc>
+        <w:tc>
+          <w:tcPr>
+            <w:tcW w:type="dxa" w:w="1956"/>
+          </w:tcPr>
+          <w:p>
+            <w:pPr>
+              <w:spacing w:before="40" w:after="60" w:line="252" w:lineRule="auto"/>
+            </w:pPr>
+            <w:r>
+              <w:rPr>
+                <w:rFonts w:ascii="Times New Roman" w:hAnsi="Times New Roman"/>
+                <w:sz w:val="18"/>
+              </w:rPr>
+              <w:t>Tasarım güçlüğünde farklı yollar denedi (3-b).</w:t>
+            </w:r>
+          </w:p>
+        </w:tc>
+        <w:tc>
+          <w:tcPr>
+            <w:tcW w:type="dxa" w:w="1956"/>
+          </w:tcPr>
+          <w:p>
+            <w:pPr>
+              <w:spacing w:before="40" w:after="60" w:line="252" w:lineRule="auto"/>
+            </w:pPr>
+            <w:r>
+              <w:rPr>
+                <w:rFonts w:ascii="Times New Roman" w:hAnsi="Times New Roman"/>
+                <w:sz w:val="18"/>
+              </w:rPr>
+              <w:t>Tasarım güçlüğünde vazgeçmeyip farklı yollar denedi (3-b).</w:t>
+            </w:r>
+          </w:p>
+        </w:tc>
+        <w:tc>
+          <w:tcPr>
+            <w:tcW w:type="dxa" w:w="1956"/>
+          </w:tcPr>
+          <w:p>
+            <w:pPr>
+              <w:spacing w:before="40" w:after="60" w:line="252" w:lineRule="auto"/>
+            </w:pPr>
+            <w:r>
+              <w:rPr>
+                <w:rFonts w:ascii="Times New Roman" w:hAnsi="Times New Roman"/>
+                <w:sz w:val="18"/>
+              </w:rPr>
+              <w:t>Çözümün probleme yanıtını sorgulayıp revize etti (3-b).</w:t>
+            </w:r>
+          </w:p>
+        </w:tc>
+      </w:tr>
+      <w:tr>
+        <w:trPr>
+          <w:cantSplit/>
+        </w:trPr>
+        <w:tc>
+          <w:tcPr>
+            <w:tcW w:type="dxa" w:w="1417"/>
+          </w:tcPr>
+          <w:p>
+            <w:pPr>
+              <w:spacing w:before="40" w:after="60" w:line="252" w:lineRule="auto"/>
+            </w:pPr>
+            <w:r>
+              <w:rPr>
+                <w:rFonts w:ascii="Times New Roman" w:hAnsi="Times New Roman"/>
+                <w:sz w:val="18"/>
+              </w:rPr>
+              <w:t>Fikir ifade etme ortamı</w:t>
+            </w:r>
+          </w:p>
+        </w:tc>
+        <w:tc>
+          <w:tcPr>
+            <w:tcW w:type="dxa" w:w="1956"/>
+          </w:tcPr>
+          <w:p>
+            <w:pPr>
+              <w:spacing w:before="40" w:after="60" w:line="252" w:lineRule="auto"/>
+            </w:pPr>
+            <w:r>
+              <w:rPr>
+                <w:rFonts w:ascii="Times New Roman" w:hAnsi="Times New Roman"/>
+                <w:sz w:val="18"/>
+              </w:rPr>
+              <w:t>Rahat ifade; kendi seçtiği grup (2-a).</w:t>
+            </w:r>
+          </w:p>
+        </w:tc>
+        <w:tc>
+          <w:tcPr>
+            <w:tcW w:type="dxa" w:w="1956"/>
+          </w:tcPr>
+          <w:p>
+            <w:pPr>
+              <w:spacing w:before="40" w:after="60" w:line="252" w:lineRule="auto"/>
+            </w:pPr>
+            <w:r>
+              <w:rPr>
+                <w:rFonts w:ascii="Times New Roman" w:hAnsi="Times New Roman"/>
+                <w:sz w:val="18"/>
+              </w:rPr>
+              <w:t>Rahat ifade; kendi seçtiği grup (2-a).</w:t>
+            </w:r>
+          </w:p>
+        </w:tc>
+        <w:tc>
+          <w:tcPr>
+            <w:tcW w:type="dxa" w:w="1956"/>
+          </w:tcPr>
+          <w:p>
+            <w:pPr>
+              <w:spacing w:before="40" w:after="60" w:line="252" w:lineRule="auto"/>
+            </w:pPr>
+            <w:r>
+              <w:rPr>
+                <w:rFonts w:ascii="Times New Roman" w:hAnsi="Times New Roman"/>
+                <w:sz w:val="18"/>
+              </w:rPr>
+              <w:t>Rahat ifade; kendi seçtiği grup (2-a).</w:t>
+            </w:r>
+          </w:p>
+        </w:tc>
+        <w:tc>
+          <w:tcPr>
+            <w:tcW w:type="dxa" w:w="1956"/>
+          </w:tcPr>
+          <w:p>
+            <w:pPr>
+              <w:spacing w:before="40" w:after="60" w:line="252" w:lineRule="auto"/>
+            </w:pPr>
+            <w:r>
+              <w:rPr>
+                <w:rFonts w:ascii="Times New Roman" w:hAnsi="Times New Roman"/>
+                <w:sz w:val="18"/>
+              </w:rPr>
+              <w:t>Rahat ifade; önceden tanışıklık (2-a).</w:t>
+            </w:r>
+          </w:p>
+        </w:tc>
+      </w:tr>
+      <w:tr>
+        <w:trPr>
+          <w:cantSplit/>
+        </w:trPr>
+        <w:tc>
+          <w:tcPr>
+            <w:tcW w:type="dxa" w:w="1417"/>
+          </w:tcPr>
+          <w:p>
+            <w:pPr>
+              <w:spacing w:before="40" w:after="60" w:line="252" w:lineRule="auto"/>
+            </w:pPr>
+            <w:r>
+              <w:rPr>
+                <w:rFonts w:ascii="Times New Roman" w:hAnsi="Times New Roman"/>
+                <w:sz w:val="18"/>
+              </w:rPr>
+              <w:t>İletişim becerisine katkı</w:t>
+            </w:r>
+          </w:p>
+        </w:tc>
+        <w:tc>
+          <w:tcPr>
+            <w:tcW w:type="dxa" w:w="1956"/>
+          </w:tcPr>
+          <w:p>
+            <w:pPr>
+              <w:spacing w:before="40" w:after="60" w:line="252" w:lineRule="auto"/>
+            </w:pPr>
+            <w:r>
+              <w:rPr>
+                <w:rFonts w:ascii="Times New Roman" w:hAnsi="Times New Roman"/>
+                <w:sz w:val="18"/>
+              </w:rPr>
+              <w:t>Özgül beceri adı yerine grup sürecini kolaylaştırma anlatımı (5-b).</w:t>
+            </w:r>
+          </w:p>
+        </w:tc>
+        <w:tc>
+          <w:tcPr>
+            <w:tcW w:type="dxa" w:w="1956"/>
+          </w:tcPr>
+          <w:p>
+            <w:pPr>
+              <w:spacing w:before="40" w:after="60" w:line="252" w:lineRule="auto"/>
+            </w:pPr>
+            <w:r>
+              <w:rPr>
+                <w:rFonts w:ascii="Times New Roman" w:hAnsi="Times New Roman"/>
+                <w:sz w:val="18"/>
+              </w:rPr>
+              <w:t>İletişime katkı belirtti (5-a); belirli beceri katkısının büyüklüğünde temkinli (5-b).</w:t>
+            </w:r>
+          </w:p>
+        </w:tc>
+        <w:tc>
+          <w:tcPr>
+            <w:tcW w:type="dxa" w:w="1956"/>
+          </w:tcPr>
+          <w:p>
+            <w:pPr>
+              <w:spacing w:before="40" w:after="60" w:line="252" w:lineRule="auto"/>
+            </w:pPr>
+            <w:r>
+              <w:rPr>
+                <w:rFonts w:ascii="Times New Roman" w:hAnsi="Times New Roman"/>
+                <w:sz w:val="18"/>
+              </w:rPr>
+              <w:t>Çekingenliğine rağmen iletişim becerisinde güçlenme bildirdi (5-b).</w:t>
+            </w:r>
+          </w:p>
+        </w:tc>
+        <w:tc>
+          <w:tcPr>
+            <w:tcW w:type="dxa" w:w="1956"/>
+          </w:tcPr>
+          <w:p>
+            <w:pPr>
+              <w:spacing w:before="40" w:after="60" w:line="252" w:lineRule="auto"/>
+            </w:pPr>
+            <w:r>
+              <w:rPr>
+                <w:rFonts w:ascii="Times New Roman" w:hAnsi="Times New Roman"/>
+                <w:sz w:val="18"/>
+              </w:rPr>
+              <w:t>İletişim ve birlikte çalışmaya katkı bildirdi (5-b).</w:t>
+            </w:r>
+          </w:p>
+        </w:tc>
+      </w:tr>
+      <w:tr>
+        <w:trPr>
+          <w:cantSplit/>
+        </w:trPr>
+        <w:tc>
+          <w:tcPr>
+            <w:tcW w:type="dxa" w:w="1417"/>
+          </w:tcPr>
+          <w:p>
+            <w:pPr>
+              <w:spacing w:before="40" w:after="60" w:line="252" w:lineRule="auto"/>
+            </w:pPr>
+            <w:r>
+              <w:rPr>
+                <w:rFonts w:ascii="Times New Roman" w:hAnsi="Times New Roman"/>
+                <w:sz w:val="18"/>
+              </w:rPr>
+              <w:t>Öğrenme algısı</w:t>
+            </w:r>
+          </w:p>
+        </w:tc>
+        <w:tc>
+          <w:tcPr>
+            <w:tcW w:type="dxa" w:w="1956"/>
+          </w:tcPr>
+          <w:p>
+            <w:pPr>
+              <w:spacing w:before="40" w:after="60" w:line="252" w:lineRule="auto"/>
+            </w:pPr>
+            <w:r>
+              <w:rPr>
+                <w:rFonts w:ascii="Times New Roman" w:hAnsi="Times New Roman"/>
+                <w:sz w:val="18"/>
+              </w:rPr>
+              <w:t>Araştırma, uygulama, ürün ve kalıcılık (4).</w:t>
+            </w:r>
+          </w:p>
+        </w:tc>
+        <w:tc>
+          <w:tcPr>
+            <w:tcW w:type="dxa" w:w="1956"/>
+          </w:tcPr>
+          <w:p>
+            <w:pPr>
+              <w:spacing w:before="40" w:after="60" w:line="252" w:lineRule="auto"/>
+            </w:pPr>
+            <w:r>
+              <w:rPr>
+                <w:rFonts w:ascii="Times New Roman" w:hAnsi="Times New Roman"/>
+                <w:sz w:val="18"/>
+              </w:rPr>
+              <w:t>Araştırma/uygulama, kalıcılık ve diğer sunumlardan öğrenme (4).</w:t>
+            </w:r>
+          </w:p>
+        </w:tc>
+        <w:tc>
+          <w:tcPr>
+            <w:tcW w:type="dxa" w:w="1956"/>
+          </w:tcPr>
+          <w:p>
+            <w:pPr>
+              <w:spacing w:before="40" w:after="60" w:line="252" w:lineRule="auto"/>
+            </w:pPr>
+            <w:r>
+              <w:rPr>
+                <w:rFonts w:ascii="Times New Roman" w:hAnsi="Times New Roman"/>
+                <w:sz w:val="18"/>
+              </w:rPr>
+              <w:t>Araştırarak/uygulayarak daha kalıcı öğrenme (4).</w:t>
+            </w:r>
+          </w:p>
+        </w:tc>
+        <w:tc>
+          <w:tcPr>
+            <w:tcW w:type="dxa" w:w="1956"/>
+          </w:tcPr>
+          <w:p>
+            <w:pPr>
+              <w:spacing w:before="40" w:after="60" w:line="252" w:lineRule="auto"/>
+            </w:pPr>
+            <w:r>
+              <w:rPr>
+                <w:rFonts w:ascii="Times New Roman" w:hAnsi="Times New Roman"/>
+                <w:sz w:val="18"/>
+              </w:rPr>
+              <w:t>Projede bilgiyi kullanma, kalıcılık ve diğer sunumlardan öğrenme (4).</w:t>
+            </w:r>
+          </w:p>
+        </w:tc>
+      </w:tr>
+      <w:tr>
+        <w:trPr>
+          <w:cantSplit/>
+        </w:trPr>
+        <w:tc>
+          <w:tcPr>
+            <w:tcW w:type="dxa" w:w="1417"/>
+          </w:tcPr>
+          <w:p>
+            <w:pPr>
+              <w:spacing w:before="40" w:after="60" w:line="252" w:lineRule="auto"/>
+            </w:pPr>
+            <w:r>
+              <w:rPr>
+                <w:rFonts w:ascii="Times New Roman" w:hAnsi="Times New Roman"/>
+                <w:sz w:val="18"/>
+              </w:rPr>
+              <w:t>Başlıca güçlükler</w:t>
+            </w:r>
+          </w:p>
+        </w:tc>
+        <w:tc>
+          <w:tcPr>
+            <w:tcW w:type="dxa" w:w="1956"/>
+          </w:tcPr>
+          <w:p>
+            <w:pPr>
+              <w:spacing w:before="40" w:after="60" w:line="252" w:lineRule="auto"/>
+            </w:pPr>
+            <w:r>
+              <w:rPr>
+                <w:rFonts w:ascii="Times New Roman" w:hAnsi="Times New Roman"/>
+                <w:sz w:val="18"/>
+              </w:rPr>
+              <w:t>Yoruculuk/maliyet (6); serbest zamanın verimsiz kullanımı (7).</w:t>
+            </w:r>
+          </w:p>
+        </w:tc>
+        <w:tc>
+          <w:tcPr>
+            <w:tcW w:type="dxa" w:w="1956"/>
+          </w:tcPr>
+          <w:p>
+            <w:pPr>
+              <w:spacing w:before="40" w:after="60" w:line="252" w:lineRule="auto"/>
+            </w:pPr>
+            <w:r>
+              <w:rPr>
+                <w:rFonts w:ascii="Times New Roman" w:hAnsi="Times New Roman"/>
+                <w:sz w:val="18"/>
+              </w:rPr>
+              <w:t>Bekleme ve farklı ilerleme hızları (6); bütçe kısıtı (7).</w:t>
+            </w:r>
+          </w:p>
+        </w:tc>
+        <w:tc>
+          <w:tcPr>
+            <w:tcW w:type="dxa" w:w="1956"/>
+          </w:tcPr>
+          <w:p>
+            <w:pPr>
+              <w:spacing w:before="40" w:after="60" w:line="252" w:lineRule="auto"/>
+            </w:pPr>
+            <w:r>
+              <w:rPr>
+                <w:rFonts w:ascii="Times New Roman" w:hAnsi="Times New Roman"/>
+                <w:sz w:val="18"/>
+              </w:rPr>
+              <w:t>Yoruculuk (6); öğretim elemanını/grupları bekleme (7).</w:t>
+            </w:r>
+          </w:p>
+        </w:tc>
+        <w:tc>
+          <w:tcPr>
+            <w:tcW w:type="dxa" w:w="1956"/>
+          </w:tcPr>
+          <w:p>
+            <w:pPr>
+              <w:spacing w:before="40" w:after="60" w:line="252" w:lineRule="auto"/>
+            </w:pPr>
+            <w:r>
+              <w:rPr>
+                <w:rFonts w:ascii="Times New Roman" w:hAnsi="Times New Roman"/>
+                <w:sz w:val="18"/>
+              </w:rPr>
+              <w:t>Uzun süren tasarım ve maliyet (6); farklı ilerleme hızları (7).</w:t>
+            </w:r>
+          </w:p>
+        </w:tc>
+      </w:tr>
+      <w:tr>
+        <w:trPr>
+          <w:cantSplit/>
+        </w:trPr>
+        <w:tc>
+          <w:tcPr>
+            <w:tcW w:type="dxa" w:w="1417"/>
+          </w:tcPr>
+          <w:p>
+            <w:pPr>
+              <w:spacing w:before="40" w:after="60" w:line="252" w:lineRule="auto"/>
+            </w:pPr>
+            <w:r>
+              <w:rPr>
+                <w:rFonts w:ascii="Times New Roman" w:hAnsi="Times New Roman"/>
+                <w:sz w:val="18"/>
+              </w:rPr>
+              <w:t>Düzenleme önerileri</w:t>
+            </w:r>
+          </w:p>
+        </w:tc>
+        <w:tc>
+          <w:tcPr>
+            <w:tcW w:type="dxa" w:w="1956"/>
+          </w:tcPr>
+          <w:p>
+            <w:pPr>
+              <w:spacing w:before="40" w:after="60" w:line="252" w:lineRule="auto"/>
+            </w:pPr>
+            <w:r>
+              <w:rPr>
+                <w:rFonts w:ascii="Times New Roman" w:hAnsi="Times New Roman"/>
+                <w:sz w:val="18"/>
+              </w:rPr>
+              <w:t>Daha fazla süre ve planlı serbest zaman (7).</w:t>
+            </w:r>
+          </w:p>
+        </w:tc>
+        <w:tc>
+          <w:tcPr>
+            <w:tcW w:type="dxa" w:w="1956"/>
+          </w:tcPr>
+          <w:p>
+            <w:pPr>
+              <w:spacing w:before="40" w:after="60" w:line="252" w:lineRule="auto"/>
+            </w:pPr>
+            <w:r>
+              <w:rPr>
+                <w:rFonts w:ascii="Times New Roman" w:hAnsi="Times New Roman"/>
+                <w:sz w:val="18"/>
+              </w:rPr>
+              <w:t>Başlangıç örnekleri, bütçe/malzeme desteği (7); küçük gruplar (1-b).</w:t>
+            </w:r>
+          </w:p>
+        </w:tc>
+        <w:tc>
+          <w:tcPr>
+            <w:tcW w:type="dxa" w:w="1956"/>
+          </w:tcPr>
+          <w:p>
+            <w:pPr>
+              <w:spacing w:before="40" w:after="60" w:line="252" w:lineRule="auto"/>
+            </w:pPr>
+            <w:r>
+              <w:rPr>
+                <w:rFonts w:ascii="Times New Roman" w:hAnsi="Times New Roman"/>
+                <w:sz w:val="18"/>
+              </w:rPr>
+              <w:t>Bekleme sürelerini azaltıp ders zamanını verimli kullanma (7).</w:t>
+            </w:r>
+          </w:p>
+        </w:tc>
+        <w:tc>
+          <w:tcPr>
+            <w:tcW w:type="dxa" w:w="1956"/>
+          </w:tcPr>
+          <w:p>
+            <w:pPr>
+              <w:spacing w:before="40" w:after="60" w:line="252" w:lineRule="auto"/>
+            </w:pPr>
+            <w:r>
+              <w:rPr>
+                <w:rFonts w:ascii="Times New Roman" w:hAnsi="Times New Roman"/>
+                <w:sz w:val="18"/>
+              </w:rPr>
+              <w:t>Örnek ve rehberlik, özerkliği koruma, aşamaya uygun farklı görevler (7).</w:t>
+            </w:r>
+          </w:p>
+        </w:tc>
+      </w:tr>
+    </w:tbl>
+    <w:p>
+      <w:pPr>
+        <w:spacing w:after="100" w:line="288" w:lineRule="auto"/>
+        <w:jc w:val="both"/>
+      </w:pPr>
+      <w:r>
+        <w:rPr>
+          <w:rFonts w:ascii="Times New Roman" w:hAnsi="Times New Roman"/>
+          <w:sz w:val="20"/>
+        </w:rPr>
+        <w:t>Not. Hücreler alıntı değil, döküme dayalı kısa analitik özetlerdir; parantezlerde kaynak soru başlığı verilmiştir. Katılımcı kodları başarı veya gelişim düzeyi göstermez. Bir deneyimin burada öne çıkarılmaması, yaşanmadığını kanıtlamaz. Yeni puan veya katılımcı verisi üretilmemiştir.</w:t>
+      </w:r>
+    </w:p>
+    <w:p>
+      <w:pPr>
         <w:jc w:val="both"/>
       </w:pPr>
       <w:r>
@@ -5342,7 +6202,7 @@
         <w:pStyle w:val="ListBullet"/>
       </w:pPr>
       <w:r>
-        <w:t>Bölüm A’yı 4.2 başlığının altına al; Tablo 4.11–4.18 numaralarını ve tablo listesini bütün teze göre güncelle. Yöntem bölümünde 4 kişi, gerçek seçim ve analiz sürecini uyumlandır.</w:t>
+        <w:t>Bölüm A’yı 4.2 başlığının altına al; Tablo 4.11–4.19 numaralarını ve tablo listesini bütün teze göre güncelle. Yöntem bölümünde 4 kişi, gerçek seçim ve analiz sürecini uyumlandır.</w:t>
       </w:r>
     </w:p>
     <w:p>
@@ -13884,6 +14744,535 @@
           <w:i w:val="0"/>
         </w:rPr>
         <w:t>Eşlik eden dosya: NITEL-KODLAMA-VE-KANIT-TABLOLARI.xlsx. Word çalışma dosyasının son hâli, araştırmacının kayıt ve kod kontrolünden sonra teze aktarılmalıdır. Hocanın K1 notlarına göre diğer üç katılımcının da aynı genel analiz mantığıyla incelenmesi yapılmıştır; bu, hocanın bütün yeni kodları onayladığı anlamına gelmez.</w:t>
+      </w:r>
+    </w:p>
+    <w:p>
+      <w:pPr>
+        <w:pStyle w:val="Heading1"/>
+        <w:pageBreakBefore/>
+      </w:pPr>
+      <w:r>
+        <w:t>EK 5 — NİCEL–NİTEL ORTAK GÖSTERİM</w:t>
+      </w:r>
+    </w:p>
+    <w:p>
+      <w:pPr>
+        <w:spacing w:after="100" w:line="312" w:lineRule="auto"/>
+        <w:jc w:val="both"/>
+      </w:pPr>
+      <w:r>
+        <w:rPr>
+          <w:rFonts w:ascii="Times New Roman" w:hAnsi="Times New Roman"/>
+          <w:sz w:val="24"/>
+        </w:rPr>
+        <w:t>Bu bölüm sonuç/tartışma ve karma yöntem bütünleştirmesi için hazırlanmış çalışma metnidir. Ana nitel bulgular metnine otomatik olarak eklenmemiştir. Nicel sonuçlar mevcut depo analizinden alınmış, puanlama veya anlamlılık sonuçları değiştirilmemiştir. Katılımcı bazında nicel puanlar ve görüşmeler arasında eşleştirme yapılmamıştır.</w:t>
+      </w:r>
+    </w:p>
+    <w:p>
+      <w:pPr>
+        <w:keepNext/>
+        <w:spacing w:after="100" w:line="312" w:lineRule="auto"/>
+        <w:jc w:val="both"/>
+      </w:pPr>
+      <w:r>
+        <w:rPr>
+          <w:rFonts w:ascii="Times New Roman" w:hAnsi="Times New Roman"/>
+          <w:b/>
+          <w:sz w:val="22"/>
+        </w:rPr>
+        <w:t>Ortak gösterim çalışma tablosu — numarası sonuç/tartışmadaki yerleşime göre belirlenecek</w:t>
+      </w:r>
+    </w:p>
+    <w:tbl>
+      <w:tblPr>
+        <w:tblStyle w:val="TableGrid"/>
+        <w:tblW w:type="auto" w:w="0"/>
+        <w:tblLayout w:type="fixed"/>
+        <w:tblLook w:firstColumn="1" w:firstRow="1" w:lastColumn="0" w:lastRow="0" w:noHBand="0" w:noVBand="1" w:val="04A0"/>
+      </w:tblPr>
+      <w:tblGrid>
+        <w:gridCol w:w="1134"/>
+        <w:gridCol w:w="1984"/>
+        <w:gridCol w:w="2268"/>
+        <w:gridCol w:w="1587"/>
+        <w:gridCol w:w="2268"/>
+      </w:tblGrid>
+      <w:tr>
+        <w:trPr>
+          <w:tblHeader/>
+          <w:cantSplit/>
+        </w:trPr>
+        <w:tc>
+          <w:tcPr>
+            <w:tcW w:type="dxa" w:w="1860"/>
+          </w:tcPr>
+          <w:p>
+            <w:pPr>
+              <w:spacing w:before="40" w:after="60" w:line="252" w:lineRule="auto"/>
+            </w:pPr>
+            <w:r>
+              <w:rPr>
+                <w:rFonts w:ascii="Times New Roman" w:hAnsi="Times New Roman"/>
+                <w:sz w:val="19"/>
+              </w:rPr>
+              <w:t>Bulgu alanı</w:t>
+            </w:r>
+          </w:p>
+        </w:tc>
+        <w:tc>
+          <w:tcPr>
+            <w:tcW w:type="dxa" w:w="1860"/>
+          </w:tcPr>
+          <w:p>
+            <w:pPr>
+              <w:spacing w:before="40" w:after="60" w:line="252" w:lineRule="auto"/>
+            </w:pPr>
+            <w:r>
+              <w:rPr>
+                <w:rFonts w:ascii="Times New Roman" w:hAnsi="Times New Roman"/>
+                <w:sz w:val="19"/>
+              </w:rPr>
+              <w:t>Nicel bulgu</w:t>
+            </w:r>
+          </w:p>
+        </w:tc>
+        <w:tc>
+          <w:tcPr>
+            <w:tcW w:type="dxa" w:w="1860"/>
+          </w:tcPr>
+          <w:p>
+            <w:pPr>
+              <w:spacing w:before="40" w:after="60" w:line="252" w:lineRule="auto"/>
+            </w:pPr>
+            <w:r>
+              <w:rPr>
+                <w:rFonts w:ascii="Times New Roman" w:hAnsi="Times New Roman"/>
+                <w:sz w:val="19"/>
+              </w:rPr>
+              <w:t>Nitel karşılık</w:t>
+            </w:r>
+          </w:p>
+        </w:tc>
+        <w:tc>
+          <w:tcPr>
+            <w:tcW w:type="dxa" w:w="1860"/>
+          </w:tcPr>
+          <w:p>
+            <w:pPr>
+              <w:spacing w:before="40" w:after="60" w:line="252" w:lineRule="auto"/>
+            </w:pPr>
+            <w:r>
+              <w:rPr>
+                <w:rFonts w:ascii="Times New Roman" w:hAnsi="Times New Roman"/>
+                <w:sz w:val="19"/>
+              </w:rPr>
+              <w:t>Birlikte okuma</w:t>
+            </w:r>
+          </w:p>
+        </w:tc>
+        <w:tc>
+          <w:tcPr>
+            <w:tcW w:type="dxa" w:w="1860"/>
+          </w:tcPr>
+          <w:p>
+            <w:pPr>
+              <w:spacing w:before="40" w:after="60" w:line="252" w:lineRule="auto"/>
+            </w:pPr>
+            <w:r>
+              <w:rPr>
+                <w:rFonts w:ascii="Times New Roman" w:hAnsi="Times New Roman"/>
+                <w:sz w:val="19"/>
+              </w:rPr>
+              <w:t>Yorum sınırı</w:t>
+            </w:r>
+          </w:p>
+        </w:tc>
+      </w:tr>
+      <w:tr>
+        <w:trPr>
+          <w:cantSplit/>
+        </w:trPr>
+        <w:tc>
+          <w:tcPr>
+            <w:tcW w:type="dxa" w:w="1134"/>
+          </w:tcPr>
+          <w:p>
+            <w:pPr>
+              <w:spacing w:before="40" w:after="60" w:line="252" w:lineRule="auto"/>
+            </w:pPr>
+            <w:r>
+              <w:rPr>
+                <w:rFonts w:ascii="Times New Roman" w:hAnsi="Times New Roman"/>
+                <w:sz w:val="19"/>
+              </w:rPr>
+              <w:t>Problem çözme toplam puanı</w:t>
+            </w:r>
+          </w:p>
+        </w:tc>
+        <w:tc>
+          <w:tcPr>
+            <w:tcW w:type="dxa" w:w="1984"/>
+          </w:tcPr>
+          <w:p>
+            <w:pPr>
+              <w:spacing w:before="40" w:after="60" w:line="252" w:lineRule="auto"/>
+            </w:pPr>
+            <w:r>
+              <w:rPr>
+                <w:rFonts w:ascii="Times New Roman" w:hAnsi="Times New Roman"/>
+                <w:sz w:val="19"/>
+              </w:rPr>
+              <w:t>Mevcut analizde N=40; ön 2.904, son 2.741; t(39)=2.372, p=.023, d_z=.375. Bu puanlamada düşük puan daha olumlu algıdır.</w:t>
+            </w:r>
+          </w:p>
+        </w:tc>
+        <w:tc>
+          <w:tcPr>
+            <w:tcW w:type="dxa" w:w="2268"/>
+          </w:tcPr>
+          <w:p>
+            <w:pPr>
+              <w:spacing w:before="40" w:after="60" w:line="252" w:lineRule="auto"/>
+            </w:pPr>
+            <w:r>
+              <w:rPr>
+                <w:rFonts w:ascii="Times New Roman" w:hAnsi="Times New Roman"/>
+                <w:sz w:val="19"/>
+              </w:rPr>
+              <w:t>Dört görüşmede problem çözmeye katkı algısı vardır (P11). K1 problemi değiştirmeyi; K2, K3 ve K4 alternatif/çözüm üzerinde çalışmayı anlatır.</w:t>
+            </w:r>
+          </w:p>
+        </w:tc>
+        <w:tc>
+          <w:tcPr>
+            <w:tcW w:type="dxa" w:w="1587"/>
+          </w:tcPr>
+          <w:p>
+            <w:pPr>
+              <w:spacing w:before="40" w:after="60" w:line="252" w:lineRule="auto"/>
+            </w:pPr>
+            <w:r>
+              <w:rPr>
+                <w:rFonts w:ascii="Times New Roman" w:hAnsi="Times New Roman"/>
+                <w:sz w:val="19"/>
+              </w:rPr>
+              <w:t>Genel yön bakımından uyum; deneyimlerde çeşitlilik.</w:t>
+            </w:r>
+          </w:p>
+        </w:tc>
+        <w:tc>
+          <w:tcPr>
+            <w:tcW w:type="dxa" w:w="2268"/>
+          </w:tcPr>
+          <w:p>
+            <w:pPr>
+              <w:spacing w:before="40" w:after="60" w:line="252" w:lineRule="auto"/>
+            </w:pPr>
+            <w:r>
+              <w:rPr>
+                <w:rFonts w:ascii="Times New Roman" w:hAnsi="Times New Roman"/>
+                <w:sz w:val="19"/>
+              </w:rPr>
+              <w:t>Görüşmeler puan değişiminin nedeni veya bağımsız doğrulaması değildir. Dört görüşmeciyle 40 kişilik eşleşmiş örneklem arasında bireysel puan eşleştirmesi yapılmadı.</w:t>
+            </w:r>
+          </w:p>
+        </w:tc>
+      </w:tr>
+      <w:tr>
+        <w:trPr>
+          <w:cantSplit/>
+        </w:trPr>
+        <w:tc>
+          <w:tcPr>
+            <w:tcW w:type="dxa" w:w="1134"/>
+          </w:tcPr>
+          <w:p>
+            <w:pPr>
+              <w:spacing w:before="40" w:after="60" w:line="252" w:lineRule="auto"/>
+            </w:pPr>
+            <w:r>
+              <w:rPr>
+                <w:rFonts w:ascii="Times New Roman" w:hAnsi="Times New Roman"/>
+                <w:sz w:val="19"/>
+              </w:rPr>
+              <w:t>Problem çözmede alt boyutlar</w:t>
+            </w:r>
+          </w:p>
+        </w:tc>
+        <w:tc>
+          <w:tcPr>
+            <w:tcW w:type="dxa" w:w="1984"/>
+          </w:tcPr>
+          <w:p>
+            <w:pPr>
+              <w:spacing w:before="40" w:after="60" w:line="252" w:lineRule="auto"/>
+            </w:pPr>
+            <w:r>
+              <w:rPr>
+                <w:rFonts w:ascii="Times New Roman" w:hAnsi="Times New Roman"/>
+                <w:sz w:val="19"/>
+              </w:rPr>
+              <w:t>Mevcut analizde Güvenme: p&lt;.001; Kişisel Kontrol: p=.013; Yaklaşma–Kaçınma: p=.584. Düzeltilmemiş p değerleri.</w:t>
+            </w:r>
+          </w:p>
+        </w:tc>
+        <w:tc>
+          <w:tcPr>
+            <w:tcW w:type="dxa" w:w="2268"/>
+          </w:tcPr>
+          <w:p>
+            <w:pPr>
+              <w:spacing w:before="40" w:after="60" w:line="252" w:lineRule="auto"/>
+            </w:pPr>
+            <w:r>
+              <w:rPr>
+                <w:rFonts w:ascii="Times New Roman" w:hAnsi="Times New Roman"/>
+                <w:sz w:val="19"/>
+              </w:rPr>
+              <w:t>K1 çözüm bulamayınca problemi değiştirir (3-b). K2/K3 tasarım sorununda alternatif dener; K4 çözümün probleme yanıtını sorgular (3-b).</w:t>
+            </w:r>
+          </w:p>
+        </w:tc>
+        <w:tc>
+          <w:tcPr>
+            <w:tcW w:type="dxa" w:w="1587"/>
+          </w:tcPr>
+          <w:p>
+            <w:pPr>
+              <w:spacing w:before="40" w:after="60" w:line="252" w:lineRule="auto"/>
+            </w:pPr>
+            <w:r>
+              <w:rPr>
+                <w:rFonts w:ascii="Times New Roman" w:hAnsi="Times New Roman"/>
+                <w:sz w:val="19"/>
+              </w:rPr>
+              <w:t>Nitel veriler tek tip olmayan süreç deneyimleri ekler.</w:t>
+            </w:r>
+          </w:p>
+        </w:tc>
+        <w:tc>
+          <w:tcPr>
+            <w:tcW w:type="dxa" w:w="2268"/>
+          </w:tcPr>
+          <w:p>
+            <w:pPr>
+              <w:spacing w:before="40" w:after="60" w:line="252" w:lineRule="auto"/>
+            </w:pPr>
+            <w:r>
+              <w:rPr>
+                <w:rFonts w:ascii="Times New Roman" w:hAnsi="Times New Roman"/>
+                <w:sz w:val="19"/>
+              </w:rPr>
+              <w:t>Bu anlatılar ölçek alt boyutlarıyla birebir eşitlenemez; anlamlı/anlamsız sonuçların nedenini kanıtladığı söylenemez.</w:t>
+            </w:r>
+          </w:p>
+        </w:tc>
+      </w:tr>
+      <w:tr>
+        <w:trPr>
+          <w:cantSplit/>
+        </w:trPr>
+        <w:tc>
+          <w:tcPr>
+            <w:tcW w:type="dxa" w:w="1134"/>
+          </w:tcPr>
+          <w:p>
+            <w:pPr>
+              <w:spacing w:before="40" w:after="60" w:line="252" w:lineRule="auto"/>
+            </w:pPr>
+            <w:r>
+              <w:rPr>
+                <w:rFonts w:ascii="Times New Roman" w:hAnsi="Times New Roman"/>
+                <w:sz w:val="19"/>
+              </w:rPr>
+              <w:t>İletişim toplam puanı</w:t>
+            </w:r>
+          </w:p>
+        </w:tc>
+        <w:tc>
+          <w:tcPr>
+            <w:tcW w:type="dxa" w:w="1984"/>
+          </w:tcPr>
+          <w:p>
+            <w:pPr>
+              <w:spacing w:before="40" w:after="60" w:line="252" w:lineRule="auto"/>
+            </w:pPr>
+            <w:r>
+              <w:rPr>
+                <w:rFonts w:ascii="Times New Roman" w:hAnsi="Times New Roman"/>
+                <w:sz w:val="19"/>
+              </w:rPr>
+              <w:t>Mevcut analizde N=44; ön 3.832, son 3.910; t(43)=1.476, p=.147, d_z=.223. Anlamlı fark saptanmadı.</w:t>
+            </w:r>
+          </w:p>
+        </w:tc>
+        <w:tc>
+          <w:tcPr>
+            <w:tcW w:type="dxa" w:w="2268"/>
+          </w:tcPr>
+          <w:p>
+            <w:pPr>
+              <w:spacing w:before="40" w:after="60" w:line="252" w:lineRule="auto"/>
+            </w:pPr>
+            <w:r>
+              <w:rPr>
+                <w:rFonts w:ascii="Times New Roman" w:hAnsi="Times New Roman"/>
+                <w:sz w:val="19"/>
+              </w:rPr>
+              <w:t>Dördü de rahat ifade ortamı anlatır (C01). K2, K3, K4 iletişim katkısı bildirir (C10); K2 büyüklükte temkinlidir (C12). K1’in 5-b yanıtı özgül beceri gelişimini adlandırmaz.</w:t>
+            </w:r>
+          </w:p>
+        </w:tc>
+        <w:tc>
+          <w:tcPr>
+            <w:tcW w:type="dxa" w:w="1587"/>
+          </w:tcPr>
+          <w:p>
+            <w:pPr>
+              <w:spacing w:before="40" w:after="60" w:line="252" w:lineRule="auto"/>
+            </w:pPr>
+            <w:r>
+              <w:rPr>
+                <w:rFonts w:ascii="Times New Roman" w:hAnsi="Times New Roman"/>
+                <w:sz w:val="19"/>
+              </w:rPr>
+              <w:t>Veri türleri arasında görünüm farklılığı; rahat ortam ve gelişim ayrımı.</w:t>
+            </w:r>
+          </w:p>
+        </w:tc>
+        <w:tc>
+          <w:tcPr>
+            <w:tcW w:type="dxa" w:w="2268"/>
+          </w:tcPr>
+          <w:p>
+            <w:pPr>
+              <w:spacing w:before="40" w:after="60" w:line="252" w:lineRule="auto"/>
+            </w:pPr>
+            <w:r>
+              <w:rPr>
+                <w:rFonts w:ascii="Times New Roman" w:hAnsi="Times New Roman"/>
+                <w:sz w:val="19"/>
+              </w:rPr>
+              <w:t>Olumlu deneyimler nicel anlamsız farkı geçersiz kılmaz. Önceden tanışıklık bağlam olarak anlatılabilir; farkın nedeninin bu olduğu gösterilmiş değildir.</w:t>
+            </w:r>
+          </w:p>
+        </w:tc>
+      </w:tr>
+      <w:tr>
+        <w:trPr>
+          <w:cantSplit/>
+        </w:trPr>
+        <w:tc>
+          <w:tcPr>
+            <w:tcW w:type="dxa" w:w="1134"/>
+          </w:tcPr>
+          <w:p>
+            <w:pPr>
+              <w:spacing w:before="40" w:after="60" w:line="252" w:lineRule="auto"/>
+            </w:pPr>
+            <w:r>
+              <w:rPr>
+                <w:rFonts w:ascii="Times New Roman" w:hAnsi="Times New Roman"/>
+                <w:sz w:val="19"/>
+              </w:rPr>
+              <w:t>Öğrenme ve süreç yönetimi</w:t>
+            </w:r>
+          </w:p>
+        </w:tc>
+        <w:tc>
+          <w:tcPr>
+            <w:tcW w:type="dxa" w:w="1984"/>
+          </w:tcPr>
+          <w:p>
+            <w:pPr>
+              <w:spacing w:before="40" w:after="60" w:line="252" w:lineRule="auto"/>
+            </w:pPr>
+            <w:r>
+              <w:rPr>
+                <w:rFonts w:ascii="Times New Roman" w:hAnsi="Times New Roman"/>
+                <w:sz w:val="19"/>
+              </w:rPr>
+              <w:t>Bu çalışma için eldeki iki ölçek, afet bilgisinde gecikmeli kalıcılığı, maliyeti veya ders içi beklemeyi doğrudan ölçmemektedir.</w:t>
+            </w:r>
+          </w:p>
+        </w:tc>
+        <w:tc>
+          <w:tcPr>
+            <w:tcW w:type="dxa" w:w="2268"/>
+          </w:tcPr>
+          <w:p>
+            <w:pPr>
+              <w:spacing w:before="40" w:after="60" w:line="252" w:lineRule="auto"/>
+            </w:pPr>
+            <w:r>
+              <w:rPr>
+                <w:rFonts w:ascii="Times New Roman" w:hAnsi="Times New Roman"/>
+                <w:sz w:val="19"/>
+              </w:rPr>
+              <w:t>Dördü kalıcılık algısı bildirir (L02). Maliyet K1/K2/K4’te (L10); bekleme K2/K3’te (L12); planlama ve rehberlik önerileri R kodlarında yer alır.</w:t>
+            </w:r>
+          </w:p>
+        </w:tc>
+        <w:tc>
+          <w:tcPr>
+            <w:tcW w:type="dxa" w:w="1587"/>
+          </w:tcPr>
+          <w:p>
+            <w:pPr>
+              <w:spacing w:before="40" w:after="60" w:line="252" w:lineRule="auto"/>
+            </w:pPr>
+            <w:r>
+              <w:rPr>
+                <w:rFonts w:ascii="Times New Roman" w:hAnsi="Times New Roman"/>
+                <w:sz w:val="19"/>
+              </w:rPr>
+              <w:t>Nitel verilerin kapsamı genişletici katkısı; doğrudan nicel eşdeğer yok.</w:t>
+            </w:r>
+          </w:p>
+        </w:tc>
+        <w:tc>
+          <w:tcPr>
+            <w:tcW w:type="dxa" w:w="2268"/>
+          </w:tcPr>
+          <w:p>
+            <w:pPr>
+              <w:spacing w:before="40" w:after="60" w:line="252" w:lineRule="auto"/>
+            </w:pPr>
+            <w:r>
+              <w:rPr>
+                <w:rFonts w:ascii="Times New Roman" w:hAnsi="Times New Roman"/>
+                <w:sz w:val="19"/>
+              </w:rPr>
+              <w:t>Öğrenme kalıcılığı nesnel olarak ölçülmüş sayılmaz. Doğrudan nicel karşılığı olmayan bu deneyimler bulgu olarak korunur; yapay bir sayı veya ölçek puanı üretilmez.</w:t>
+            </w:r>
+          </w:p>
+        </w:tc>
+      </w:tr>
+    </w:tbl>
+    <w:p>
+      <w:pPr>
+        <w:spacing w:after="100" w:line="312" w:lineRule="auto"/>
+        <w:jc w:val="both"/>
+      </w:pPr>
+      <w:r>
+        <w:rPr>
+          <w:rFonts w:ascii="Times New Roman" w:hAnsi="Times New Roman"/>
+          <w:sz w:val="24"/>
+        </w:rPr>
+        <w:t>Bütünleştirme için metin önerisi: Nicel ve nitel bulgular, problem çözmeye ilişkin genel olumlu değişim/katkı görünümünde benzer bir yön sunarken süreç deneyimlerinin bütün katılımcılarda aynı olmadığını göstermektedir. İletişimde olumlu deneyim ve katkı anlatıları bulunmasına rağmen ölçek toplamında istatistiksel olarak anlamlı fark saptanmamıştır. Bu iki sonuç birbirinin yerine geçirilmemeli; nicel ölçümün puan değişimini, görüşmelerin ise dört katılımcının deneyim ve öz değerlendirmelerini görünür kıldığı dikkate alınmalıdır. Öğrenme kalıcılığı algısı, maliyet ve bekleme gibi görüşme konuları ise mevcut ölçeklerin doğrudan ölçmediği süreç boyutlarını eklemektedir. Bu tablo, gözlenen değişimlerin yalnızca uygulamadan kaynaklandığını veya nitel anlatıların belirli bir p değerinin nedenini açıkladığını göstermemektedir.</w:t>
+      </w:r>
+    </w:p>
+    <w:p>
+      <w:pPr>
+        <w:spacing w:after="100" w:line="288" w:lineRule="auto"/>
+        <w:jc w:val="both"/>
+      </w:pPr>
+      <w:r>
+        <w:rPr>
+          <w:rFonts w:ascii="Times New Roman" w:hAnsi="Times New Roman"/>
+          <w:sz w:val="20"/>
+        </w:rPr>
+        <w:t>Araştırmacı kontrolü: Bu ortak gösterimin kullanılması tek başına araştırma desenini açımlayıcı sıralı ya da yakınsayan olarak belirlemez. Nitel aşamanın nicel sonuçlarla nasıl ilişkilendirilerek planlandığı ve yorumlama aşamasındaki bütünleştirme kararları yöntemde gerçek uygulamaya göre açıklanmalıdır. PÇBÖ sonuçları kullanıcının esas alınmasını istediği mevcut analiz yapısıyla sunulmuştur; kaynak anahtarın bağımsız doğrulandığı iddiası eklenmemiştir.</w:t>
       </w:r>
     </w:p>
     <w:sectPr>

</xml_diff>